<commit_message>
docs(balotario): PgBouncer, teoria del indice HNSW y distancia coseno, diagrama de arquitectura en alta resolucion
Co-Authored-By: Claude Opus 5.5 <noreply@anthropic.com>
</commit_message>
<xml_diff>
--- a/RUTA_DEL_CURSO/01_CASO_Y_ARQUITECTURA/URPOnline_Navidad_CyberMonday_Catalogo_Nocturno_40_Preguntas.docx
+++ b/RUTA_DEL_CURSO/01_CASO_Y_ARQUITECTURA/URPOnline_Navidad_CyberMonday_Catalogo_Nocturno_40_Preguntas.docx
@@ -3786,7 +3786,30 @@
         <w:rPr>
           <w:sz w:val="19"/>
         </w:rPr>
-        <w:t>La búsqueda semántica ordena por distancia coseno (operador &lt;=&gt;). Sin índice compara contra todos los productos; HNSW es un grafo que llega a los más cercanos en pocos pasos. En URPOnline: migración BusquedaVectorialPgvector, índice IX_ProductEmbeddings_Embedding_hnsw. Cada producto se representa con un vector (embedding) de 384 números que resume su significado.</w:t>
+        <w:t>La búsqueda semántica ordena por distancia coseno (operador &lt;=&gt;). Sin índice compara contra todos los productos; HNSW es un grafo que llega a los más cercanos en pocos pasos. En URPOnline: migración BusquedaVectorialPgvector, índice IX_ProductEmbeddings_Embedding_hnsw. Cada producto se representa con un vector (embedding) de 384 números que resume su significado. La distancia coseno es la métrica que gradúa la proximidad entre productos: cuanto más cerca de 0, más parecido es el significado. Por eso la búsqueda semántica no exige escribir el nombre completo ni exacto: con lo que el cliente lleva escrito, la tienda puede sugerir mientras escribe los productos más cercanos. Una búsqueda por el nombre completo (por ejemplo, el nombre como clave en Redis) solo encuentra coincidencias exactas.</w:t>
+      </w:r>
+    </w:p>
+    <w:p>
+      <w:pPr>
+        <w:spacing w:before="80" w:after="240"/>
+        <w:ind w:left="170"/>
+        <w:shd w:val="clear" w:color="auto" w:fill="E8F5EC"/>
+        <w:pBdr>
+          <w:left w:val="single" w:sz="18" w:space="6" w:color="1A7F37"/>
+        </w:pBdr>
+      </w:pPr>
+      <w:r>
+        <w:rPr>
+          <w:b/>
+          <w:color w:val="1A7F37"/>
+        </w:rPr>
+        <w:t xml:space="preserve">Teoría — índice y distancia coseno. Un índice es una estructura adicional que la base de datos mantiene para no recorrer toda la tabla en cada búsqueda, como el índice de un libro. Para valores exactos (un Id, un nombre completo) PostgreSQL usa su índice normal (B-tree), que solo sirve si se busca el valor exacto o su comienzo. Para buscar por significado, cada producto se convierte en un embedding: un vector de 384 números; dos productos parecidos tienen vectores que apuntan en direcciones parecidas. La distancia coseno mide justamente el ángulo entre dos vectores: 0 significa la misma dirección (mismo significado), cerca de 1 sin relación y 2 opuestos; en pgvector se escribe con el operador &lt;=&gt; y se ordena de menor a mayor para obtener primero los más cercanos. Así se gradúa el nivel de proximidad: se puede mostrar solo lo que esté por debajo de cierta distancia. Comparar el vector de lo que el cliente escribe contra todos los productos sería lento; el índice HNSW (Hierarchical Navigable Small World) organiza los vectores en un grafo por capas y salta hacia los vecinos más cercanos en pocos pasos, por eso la tienda puede sugerir productos mientras el cliente escribe, sin que termine el nombre completo. HNSW da resultados aproximados (puede omitir algún vecino muy cercano) a cambio de mucha velocidad.</w:t>
+      </w:r>
+      <w:r>
+        <w:rPr>
+          <w:sz w:val="19"/>
+        </w:rPr>
+        <w:t/>
       </w:r>
     </w:p>
     <w:p>

</xml_diff>